<commit_message>
Actualizar la documentacion con las correcciones de seguridad (spec 004a)
ERS V1.6 y Casos de Uso V1.3 recogen el confinamiento de rutas, la descarga solo de documentos propios y la carpeta de documentos sin publicar. La arquitectura C4 agrega el componente de avatares, unica excepcion publica. Se agregan los PDF vigentes y se regenera el diagrama de componentes de la API.
</commit_message>
<xml_diff>
--- a/Documentacion/Documentacion_ServIA_2026/Arquitectura C4 - ServIA.docx
+++ b/Documentacion/Documentacion_ServIA_2026/Arquitectura C4 - ServIA.docx
@@ -122,7 +122,7 @@
           <w:sz w:val="22"/>
           <w:szCs w:val="22"/>
         </w:rPr>
-        <w:t xml:space="preserve">1.0</w:t>
+        <w:t xml:space="preserve">1.1</w:t>
       </w:r>
     </w:p>
     <w:p>
@@ -5642,7 +5642,7 @@
       <w:r>
         <w:drawing>
           <wp:inline distT="0" distB="0" distL="0" distR="0">
-            <wp:extent cx="9144000" cy="5667375"/>
+            <wp:extent cx="9144000" cy="5087689"/>
             <wp:effectExtent t="0" r="0" b="0" l="0"/>
             <wp:docPr id="3" name="" descr="" title=""/>
             <wp:cNvGraphicFramePr>
@@ -5667,7 +5667,7 @@
                   <pic:spPr bwMode="auto">
                     <a:xfrm>
                       <a:off x="0" y="0"/>
-                      <a:ext cx="9144000" cy="5667375"/>
+                      <a:ext cx="9144000" cy="5087689"/>
                     </a:xfrm>
                     <a:prstGeom prst="rect">
                       <a:avLst/>
@@ -5924,7 +5924,7 @@
                 <w:sz w:val="19"/>
                 <w:szCs w:val="19"/>
               </w:rPr>
-              <w:t xml:space="preserve">Punto de entrada de la API: monta los routers de cada módulo, configura CORS y los archivos estáticos, y al iniciar carga el modelo de embeddings y verifica la conexión con Qdrant (si algo falla, la API no arranca).</w:t>
+              <w:t xml:space="preserve">Punto de entrada de la API: monta los routers de cada módulo, incluida la entrega pública de avatares, configura CORS, y al iniciar carga el modelo de embeddings y verifica la conexión con Qdrant (si algo falla, la API no arranca).</w:t>
             </w:r>
           </w:p>
         </w:tc>
@@ -6941,6 +6941,116 @@
                 <w:szCs w:val="19"/>
               </w:rPr>
               <w:t xml:space="preserve">RF‑12, RF‑20</w:t>
+            </w:r>
+          </w:p>
+        </w:tc>
+      </w:tr>
+      <w:tr>
+        <w:trPr>
+          <w:cantSplit/>
+        </w:trPr>
+        <w:tc>
+          <w:tcPr>
+            <w:tcW w:type="dxa" w:w="1850"/>
+            <w:shd w:fill="EAF1F8" w:val="clear"/>
+            <w:tcMar>
+              <w:top w:type="dxa" w:w="60"/>
+              <w:left w:type="dxa" w:w="90"/>
+              <w:bottom w:type="dxa" w:w="60"/>
+              <w:right w:type="dxa" w:w="90"/>
+            </w:tcMar>
+          </w:tcPr>
+          <w:p>
+            <w:pPr>
+              <w:spacing w:after="0"/>
+            </w:pPr>
+            <w:r>
+              <w:rPr>
+                <w:rFonts w:ascii="Calibri" w:cs="Calibri" w:eastAsia="Calibri" w:hAnsi="Calibri"/>
+                <w:b/>
+                <w:bCs/>
+                <w:sz w:val="19"/>
+                <w:szCs w:val="19"/>
+              </w:rPr>
+              <w:t xml:space="preserve">Avatares públicos</w:t>
+            </w:r>
+          </w:p>
+        </w:tc>
+        <w:tc>
+          <w:tcPr>
+            <w:tcW w:type="dxa" w:w="2350"/>
+            <w:tcMar>
+              <w:top w:type="dxa" w:w="60"/>
+              <w:left w:type="dxa" w:w="90"/>
+              <w:bottom w:type="dxa" w:w="60"/>
+              <w:right w:type="dxa" w:w="90"/>
+            </w:tcMar>
+          </w:tcPr>
+          <w:p>
+            <w:pPr>
+              <w:spacing w:after="0"/>
+            </w:pPr>
+            <w:r>
+              <w:rPr>
+                <w:rFonts w:ascii="Calibri" w:cs="Calibri" w:eastAsia="Calibri" w:hAnsi="Calibri"/>
+                <w:b w:val="false"/>
+                <w:bCs w:val="false"/>
+                <w:sz w:val="19"/>
+                <w:szCs w:val="19"/>
+              </w:rPr>
+              <w:t xml:space="preserve">routes/​avatares.py</w:t>
+            </w:r>
+          </w:p>
+        </w:tc>
+        <w:tc>
+          <w:tcPr>
+            <w:tcW w:type="dxa" w:w="4000"/>
+            <w:tcMar>
+              <w:top w:type="dxa" w:w="60"/>
+              <w:left w:type="dxa" w:w="90"/>
+              <w:bottom w:type="dxa" w:w="60"/>
+              <w:right w:type="dxa" w:w="90"/>
+            </w:tcMar>
+          </w:tcPr>
+          <w:p>
+            <w:pPr>
+              <w:spacing w:after="0"/>
+            </w:pPr>
+            <w:r>
+              <w:rPr>
+                <w:rFonts w:ascii="Calibri" w:cs="Calibri" w:eastAsia="Calibri" w:hAnsi="Calibri"/>
+                <w:b w:val="false"/>
+                <w:bCs w:val="false"/>
+                <w:sz w:val="19"/>
+                <w:szCs w:val="19"/>
+              </w:rPr>
+              <w:t xml:space="preserve">Entrega solo las fotografías de perfil por GET y HEAD en /uploads/profiles/{nombre}, sin sesión y con Vary: Origin. Es una excepción deliberada a «todo endpoint exige rol» (RF-04.20, RNF-07.22); la carpeta de documentos no se publica.</w:t>
+            </w:r>
+          </w:p>
+        </w:tc>
+        <w:tc>
+          <w:tcPr>
+            <w:tcW w:type="dxa" w:w="1160"/>
+            <w:tcMar>
+              <w:top w:type="dxa" w:w="60"/>
+              <w:left w:type="dxa" w:w="90"/>
+              <w:bottom w:type="dxa" w:w="60"/>
+              <w:right w:type="dxa" w:w="90"/>
+            </w:tcMar>
+          </w:tcPr>
+          <w:p>
+            <w:pPr>
+              <w:spacing w:after="0"/>
+            </w:pPr>
+            <w:r>
+              <w:rPr>
+                <w:rFonts w:ascii="Calibri" w:cs="Calibri" w:eastAsia="Calibri" w:hAnsi="Calibri"/>
+                <w:b w:val="false"/>
+                <w:bCs w:val="false"/>
+                <w:sz w:val="19"/>
+                <w:szCs w:val="19"/>
+              </w:rPr>
+              <w:t xml:space="preserve">RF‑04, RNF‑07</w:t>
             </w:r>
           </w:p>
         </w:tc>

</xml_diff>